<commit_message>
Replace unpreviewable Word-only pack with HTML/PDF and a comprehensive CVM demo PNG.
Adds a 2x demo board covering CVM cycle, both Codzure products, confirm-gated UIs, architecture, and scorecard, plus CVM-PACK.html for Cursor/GitHub.

Co-authored-by: kamauSft <kamauSft@users.noreply.github.com>
</commit_message>
<xml_diff>
--- a/agent/CVM-Agentic-AI-Neo-Nyumba-Zetu.docx
+++ b/agent/CVM-Agentic-AI-Neo-Nyumba-Zetu.docx
@@ -89,7 +89,7 @@
           <w:color w:val="4D6270"/>
           <w:sz w:val="20"/>
         </w:rPr>
-        <w:t>Companion demo board: agent/demo.html  ·  Full narrative: agent/BUSINESS_CASE.md</w:t>
+        <w:t>If Word preview is blocked: open agent/CVM-PACK.html or agent/CVM-Agentic-AI-Neo-Nyumba-Zetu.pdf. Demo board: agent/demo.html. Narrative: agent/BUSINESS_CASE.md</w:t>
       </w:r>
     </w:p>
     <w:p>
@@ -1533,7 +1533,7 @@
       <w:r>
         <w:drawing>
           <wp:inline xmlns:a="http://schemas.openxmlformats.org/drawingml/2006/main" xmlns:pic="http://schemas.openxmlformats.org/drawingml/2006/picture">
-            <wp:extent cx="6035040" cy="4274820"/>
+            <wp:extent cx="6035040" cy="4840605"/>
             <wp:docPr id="1" name="Picture 1"/>
             <wp:cNvGraphicFramePr>
               <a:graphicFrameLocks noChangeAspect="1"/>
@@ -1554,7 +1554,7 @@
                   <pic:spPr>
                     <a:xfrm>
                       <a:off x="0" y="0"/>
-                      <a:ext cx="6035040" cy="4274820"/>
+                      <a:ext cx="6035040" cy="4840605"/>
                     </a:xfrm>
                     <a:prstGeom prst="rect"/>
                   </pic:spPr>

</xml_diff>